<commit_message>
Record Neon storage delivery and final verification evidence
</commit_message>
<xml_diff>
--- a/docs/reports/2026-10-28-neon-private-storage.docx
+++ b/docs/reports/2026-10-28-neon-private-storage.docx
@@ -162,7 +162,7 @@
     </w:p>
     <w:p>
       <w:r>
-        <w:t>The final complete run at 13:36:09 UTC passes all 60 checks with zero failures, including eleven exact-object cleanup checks. A subsequent fresh, non-truncated inventory shows zero objects in all six buckets and zero parent buckets. The unused write-only credential remains in provider history with a revocation timestamp; it is not an active worker credential. The repository security heuristics pass with 516 files scanned, 139 skipped and zero findings. That heuristic count is separate from the complete 53-file unit coverage inventory.</w:t>
+        <w:t>The final complete run at 13:36:09 UTC passes all 60 checks with zero failures, including eleven exact-object cleanup checks. A subsequent fresh, non-truncated inventory shows zero objects in all six buckets and zero parent buckets. The unused write-only credential remains in provider history with a revocation timestamp; it is not an active worker credential. The repository security heuristics pass with 516 files scanned, 140 skipped and zero findings. That heuristic count is separate from the complete 53-file unit coverage inventory.</w:t>
       </w:r>
     </w:p>
     <w:p>
@@ -275,6 +275,11 @@
     <w:p>
       <w:r>
         <w:t>Visual rendering was attempted with the document renderer and failed with WinError 2 because LibreOffice/soffice is absent from PATH and the standard installation location. No page images or visual acceptance are claimed. Render and inspect the Word report on a workstation with LibreOffice before external document circulation. Git whitespace checks pass; unrelated user files and attachments are preserved and excluded from this storage slice.</w:t>
+      </w:r>
+    </w:p>
+    <w:p>
+      <w:r>
+        <w:t>Storage implementation and initial report commit: 5f297584271592e5a4415e7538229527566d02c2 on feature/phase1-staging-readiness. The explicit origin push exits successfully with Everything up-to-date after the initial restricted push stalled. This handover amendment records the final scan count and delivery receipt. No force push, main merge, Vercel promotion or phase-completion claim is made.</w:t>
       </w:r>
     </w:p>
     <w:sectPr>

</xml_diff>